<commit_message>
feat: Add initial implementation of AIML Hub website with HTML, CSS, and JavaScript
- Created index.html for the main structure of the website
- Added script.js for interactivity including theme toggle, modal functionality, and event slider
- Implemented style.css for responsive design and dark mode support
- Included sections for notification, navigation, hero, events, FAQ, and contact
</commit_message>
<xml_diff>
--- a/25AIML071_Pr1/WT_Pr1.docx
+++ b/25AIML071_Pr1/WT_Pr1.docx
@@ -50,6 +50,7 @@
       <w:tblPr>
         <w:tblStyle w:val="TableGrid"/>
         <w:tblW w:w="0" w:type="auto"/>
+        <w:tblInd w:w="-5" w:type="dxa"/>
         <w:tblLook w:val="04A0" w:firstRow="1" w:lastRow="0" w:firstColumn="1" w:lastColumn="0" w:noHBand="0" w:noVBand="1"/>
       </w:tblPr>
       <w:tblGrid>
@@ -168,10 +169,12 @@
               </w:rPr>
             </w:pPr>
             <w:proofErr w:type="spellStart"/>
+            <w:proofErr w:type="gramStart"/>
             <w:r>
               <w:t>B.Tech</w:t>
             </w:r>
             <w:proofErr w:type="spellEnd"/>
+            <w:proofErr w:type="gramEnd"/>
             <w:r>
               <w:t xml:space="preserve"> – Artificial Intelligence and Machine Learning</w:t>
             </w:r>
@@ -274,7 +277,15 @@
           <w:b/>
           <w:bCs/>
         </w:rPr>
-        <w:t>Problem Definition</w:t>
+        <w:t xml:space="preserve">Problem </w:t>
+      </w:r>
+      <w:proofErr w:type="gramStart"/>
+      <w:r>
+        <w:rPr>
+          <w:b/>
+          <w:bCs/>
+        </w:rPr>
+        <w:t>Definition</w:t>
       </w:r>
       <w:r>
         <w:rPr>
@@ -283,6 +294,7 @@
         </w:rPr>
         <w:t xml:space="preserve"> :</w:t>
       </w:r>
+      <w:proofErr w:type="gramEnd"/>
     </w:p>
     <w:p>
       <w:pPr>
@@ -442,6 +454,7 @@
         <w:rPr>
           <w:b/>
           <w:bCs/>
+          <w:noProof/>
           <w:sz w:val="28"/>
           <w:szCs w:val="28"/>
         </w:rPr>

</xml_diff>